<commit_message>
estadisticas descriptivas y regresiones finales
</commit_message>
<xml_diff>
--- a/src/results/chile/results_general.docx
+++ b/src/results/chile/results_general.docx
@@ -2,7 +2,7 @@
 <file path=word/document.xml><?xml version="1.0" encoding="utf-8"?>
 <w:document xmlns:w="http://schemas.openxmlformats.org/wordprocessingml/2006/main" xmlns:m="http://schemas.openxmlformats.org/officeDocument/2006/math" xmlns:r="http://schemas.openxmlformats.org/officeDocument/2006/relationships" xmlns:o="urn:schemas-microsoft-com:office:office" xmlns:v="urn:schemas-microsoft-com:vml" xmlns:w10="urn:schemas-microsoft-com:office:word" xmlns:a="http://schemas.openxmlformats.org/drawingml/2006/main" xmlns:pic="http://schemas.openxmlformats.org/drawingml/2006/picture" xmlns:wp="http://schemas.openxmlformats.org/drawingml/2006/wordprocessingDrawing">
   <w:body>
-    <w:bookmarkStart w:id="9" w:name="czibdbszkc"/>
+    <w:bookmarkStart w:id="9" w:name="yhnontonib"/>
     <w:tbl>
       <w:tblPr>
         <w:tblStyle w:val="Table"/>
@@ -122,30 +122,30 @@
               <w:pStyle w:val="Compact"/>
             </w:pPr>
             <w:r>
-              <w:t xml:space="preserve">-0.039</w:t>
+              <w:t xml:space="preserve">0.156*</w:t>
             </w:r>
             <w:r>
               <w:br/>
             </w:r>
             <w:r>
-              <w:t xml:space="preserve">(0.018)</w:t>
-            </w:r>
-          </w:p>
-        </w:tc>
-        <w:tc>
-          <w:tcPr/>
-          <w:p>
-            <w:pPr>
-              <w:pStyle w:val="Compact"/>
-            </w:pPr>
-            <w:r>
-              <w:t xml:space="preserve">0.664**</w:t>
+              <w:t xml:space="preserve">(0.027)</w:t>
+            </w:r>
+          </w:p>
+        </w:tc>
+        <w:tc>
+          <w:tcPr/>
+          <w:p>
+            <w:pPr>
+              <w:pStyle w:val="Compact"/>
+            </w:pPr>
+            <w:r>
+              <w:t xml:space="preserve">0.656**</w:t>
             </w:r>
             <w:r>
               <w:br/>
             </w:r>
             <w:r>
-              <w:t xml:space="preserve">(0.099)</w:t>
+              <w:t xml:space="preserve">(0.097)</w:t>
             </w:r>
           </w:p>
         </w:tc>
@@ -169,30 +169,30 @@
               <w:pStyle w:val="Compact"/>
             </w:pPr>
             <w:r>
-              <w:t xml:space="preserve">0.231</w:t>
+              <w:t xml:space="preserve">-0.078</w:t>
             </w:r>
             <w:r>
               <w:br/>
             </w:r>
             <w:r>
-              <w:t xml:space="preserve">(0.146)</w:t>
-            </w:r>
-          </w:p>
-        </w:tc>
-        <w:tc>
-          <w:tcPr/>
-          <w:p>
-            <w:pPr>
-              <w:pStyle w:val="Compact"/>
-            </w:pPr>
-            <w:r>
-              <w:t xml:space="preserve">0.388</w:t>
+              <w:t xml:space="preserve">(0.182)</w:t>
+            </w:r>
+          </w:p>
+        </w:tc>
+        <w:tc>
+          <w:tcPr/>
+          <w:p>
+            <w:pPr>
+              <w:pStyle w:val="Compact"/>
+            </w:pPr>
+            <w:r>
+              <w:t xml:space="preserve">0.913</w:t>
             </w:r>
             <w:r>
               <w:br/>
             </w:r>
             <w:r>
-              <w:t xml:space="preserve">(0.474)</w:t>
+              <w:t xml:space="preserve">(0.329)</w:t>
             </w:r>
           </w:p>
         </w:tc>
@@ -216,30 +216,30 @@
               <w:pStyle w:val="Compact"/>
             </w:pPr>
             <w:r>
-              <w:t xml:space="preserve">-0.020</w:t>
+              <w:t xml:space="preserve">0.088</w:t>
             </w:r>
             <w:r>
               <w:br/>
             </w:r>
             <w:r>
-              <w:t xml:space="preserve">(0.114)</w:t>
-            </w:r>
-          </w:p>
-        </w:tc>
-        <w:tc>
-          <w:tcPr/>
-          <w:p>
-            <w:pPr>
-              <w:pStyle w:val="Compact"/>
-            </w:pPr>
-            <w:r>
-              <w:t xml:space="preserve">-0.850*</w:t>
+              <w:t xml:space="preserve">(0.103)</w:t>
+            </w:r>
+          </w:p>
+        </w:tc>
+        <w:tc>
+          <w:tcPr/>
+          <w:p>
+            <w:pPr>
+              <w:pStyle w:val="Compact"/>
+            </w:pPr>
+            <w:r>
+              <w:t xml:space="preserve">-1.198**</w:t>
             </w:r>
             <w:r>
               <w:br/>
             </w:r>
             <w:r>
-              <w:t xml:space="preserve">(0.239)</w:t>
+              <w:t xml:space="preserve">(0.117)</w:t>
             </w:r>
           </w:p>
         </w:tc>
@@ -363,18 +363,18 @@
               <w:pStyle w:val="Compact"/>
             </w:pPr>
             <w:r>
-              <w:t xml:space="preserve">219,222</w:t>
-            </w:r>
-          </w:p>
-        </w:tc>
-        <w:tc>
-          <w:tcPr/>
-          <w:p>
-            <w:pPr>
-              <w:pStyle w:val="Compact"/>
-            </w:pPr>
-            <w:r>
-              <w:t xml:space="preserve">82,593</w:t>
+              <w:t xml:space="preserve">244,976</w:t>
+            </w:r>
+          </w:p>
+        </w:tc>
+        <w:tc>
+          <w:tcPr/>
+          <w:p>
+            <w:pPr>
+              <w:pStyle w:val="Compact"/>
+            </w:pPr>
+            <w:r>
+              <w:t xml:space="preserve">67,161</w:t>
             </w:r>
           </w:p>
         </w:tc>
@@ -439,18 +439,18 @@
               <w:pStyle w:val="Compact"/>
             </w:pPr>
             <w:r>
-              <w:t xml:space="preserve">0.163</w:t>
-            </w:r>
-          </w:p>
-        </w:tc>
-        <w:tc>
-          <w:tcPr/>
-          <w:p>
-            <w:pPr>
-              <w:pStyle w:val="Compact"/>
-            </w:pPr>
-            <w:r>
-              <w:t xml:space="preserve">0.119</w:t>
+              <w:t xml:space="preserve">0.033</w:t>
+            </w:r>
+          </w:p>
+        </w:tc>
+        <w:tc>
+          <w:tcPr/>
+          <w:p>
+            <w:pPr>
+              <w:pStyle w:val="Compact"/>
+            </w:pPr>
+            <w:r>
+              <w:t xml:space="preserve">0.127</w:t>
             </w:r>
           </w:p>
         </w:tc>
@@ -486,18 +486,18 @@
               <w:pStyle w:val="Compact"/>
             </w:pPr>
             <w:r>
-              <w:t xml:space="preserve">0.156</w:t>
-            </w:r>
-          </w:p>
-        </w:tc>
-        <w:tc>
-          <w:tcPr/>
-          <w:p>
-            <w:pPr>
-              <w:pStyle w:val="Compact"/>
-            </w:pPr>
-            <w:r>
-              <w:t xml:space="preserve">0.070</w:t>
+              <w:t xml:space="preserve">0.027</w:t>
+            </w:r>
+          </w:p>
+        </w:tc>
+        <w:tc>
+          <w:tcPr/>
+          <w:p>
+            <w:pPr>
+              <w:pStyle w:val="Compact"/>
+            </w:pPr>
+            <w:r>
+              <w:t xml:space="preserve">0.076</w:t>
             </w:r>
           </w:p>
         </w:tc>

</xml_diff>

<commit_message>
Revision final reviewers / Migration Studies / añadir escenario base usando 2017
</commit_message>
<xml_diff>
--- a/src/results/chile/results_general.docx
+++ b/src/results/chile/results_general.docx
@@ -2,7 +2,7 @@
 <file path=word/document.xml><?xml version="1.0" encoding="utf-8"?>
 <w:document xmlns:w="http://schemas.openxmlformats.org/wordprocessingml/2006/main" xmlns:m="http://schemas.openxmlformats.org/officeDocument/2006/math" xmlns:r="http://schemas.openxmlformats.org/officeDocument/2006/relationships" xmlns:o="urn:schemas-microsoft-com:office:office" xmlns:v="urn:schemas-microsoft-com:vml" xmlns:w10="urn:schemas-microsoft-com:office:word" xmlns:a="http://schemas.openxmlformats.org/drawingml/2006/main" xmlns:pic="http://schemas.openxmlformats.org/drawingml/2006/picture" xmlns:wp="http://schemas.openxmlformats.org/drawingml/2006/wordprocessingDrawing">
   <w:body>
-    <w:bookmarkStart w:id="9" w:name="yhnontonib"/>
+    <w:bookmarkStart w:id="9" w:name="yhslrfmaqb"/>
     <w:tbl>
       <w:tblPr>
         <w:tblStyle w:val="Table"/>
@@ -122,30 +122,30 @@
               <w:pStyle w:val="Compact"/>
             </w:pPr>
             <w:r>
-              <w:t xml:space="preserve">0.156*</w:t>
+              <w:t xml:space="preserve">0.123**</w:t>
             </w:r>
             <w:r>
               <w:br/>
             </w:r>
             <w:r>
-              <w:t xml:space="preserve">(0.027)</w:t>
-            </w:r>
-          </w:p>
-        </w:tc>
-        <w:tc>
-          <w:tcPr/>
-          <w:p>
-            <w:pPr>
-              <w:pStyle w:val="Compact"/>
-            </w:pPr>
-            <w:r>
-              <w:t xml:space="preserve">0.656**</w:t>
+              <w:t xml:space="preserve">(0.012)</w:t>
+            </w:r>
+          </w:p>
+        </w:tc>
+        <w:tc>
+          <w:tcPr/>
+          <w:p>
+            <w:pPr>
+              <w:pStyle w:val="Compact"/>
+            </w:pPr>
+            <w:r>
+              <w:t xml:space="preserve">0.590**</w:t>
             </w:r>
             <w:r>
               <w:br/>
             </w:r>
             <w:r>
-              <w:t xml:space="preserve">(0.097)</w:t>
+              <w:t xml:space="preserve">(0.046)</w:t>
             </w:r>
           </w:p>
         </w:tc>
@@ -169,30 +169,30 @@
               <w:pStyle w:val="Compact"/>
             </w:pPr>
             <w:r>
-              <w:t xml:space="preserve">-0.078</w:t>
+              <w:t xml:space="preserve">-0.003</w:t>
             </w:r>
             <w:r>
               <w:br/>
             </w:r>
             <w:r>
-              <w:t xml:space="preserve">(0.182)</w:t>
-            </w:r>
-          </w:p>
-        </w:tc>
-        <w:tc>
-          <w:tcPr/>
-          <w:p>
-            <w:pPr>
-              <w:pStyle w:val="Compact"/>
-            </w:pPr>
-            <w:r>
-              <w:t xml:space="preserve">0.913</w:t>
+              <w:t xml:space="preserve">(0.084)</w:t>
+            </w:r>
+          </w:p>
+        </w:tc>
+        <w:tc>
+          <w:tcPr/>
+          <w:p>
+            <w:pPr>
+              <w:pStyle w:val="Compact"/>
+            </w:pPr>
+            <w:r>
+              <w:t xml:space="preserve">0.164</w:t>
             </w:r>
             <w:r>
               <w:br/>
             </w:r>
             <w:r>
-              <w:t xml:space="preserve">(0.329)</w:t>
+              <w:t xml:space="preserve">(0.531)</w:t>
             </w:r>
           </w:p>
         </w:tc>
@@ -216,30 +216,30 @@
               <w:pStyle w:val="Compact"/>
             </w:pPr>
             <w:r>
-              <w:t xml:space="preserve">0.088</w:t>
+              <w:t xml:space="preserve">-0.001</w:t>
             </w:r>
             <w:r>
               <w:br/>
             </w:r>
             <w:r>
-              <w:t xml:space="preserve">(0.103)</w:t>
-            </w:r>
-          </w:p>
-        </w:tc>
-        <w:tc>
-          <w:tcPr/>
-          <w:p>
-            <w:pPr>
-              <w:pStyle w:val="Compact"/>
-            </w:pPr>
-            <w:r>
-              <w:t xml:space="preserve">-1.198**</w:t>
+              <w:t xml:space="preserve">(0.038)</w:t>
+            </w:r>
+          </w:p>
+        </w:tc>
+        <w:tc>
+          <w:tcPr/>
+          <w:p>
+            <w:pPr>
+              <w:pStyle w:val="Compact"/>
+            </w:pPr>
+            <w:r>
+              <w:t xml:space="preserve">-0.541</w:t>
             </w:r>
             <w:r>
               <w:br/>
             </w:r>
             <w:r>
-              <w:t xml:space="preserve">(0.117)</w:t>
+              <w:t xml:space="preserve">(0.279)</w:t>
             </w:r>
           </w:p>
         </w:tc>
@@ -267,7 +267,7 @@
               <w:pStyle w:val="Compact"/>
             </w:pPr>
             <w:r>
-              <w:t xml:space="preserve">anno</w:t>
+              <w:t xml:space="preserve">region</w:t>
             </w:r>
           </w:p>
         </w:tc>
@@ -302,7 +302,7 @@
               <w:pStyle w:val="Compact"/>
             </w:pPr>
             <w:r>
-              <w:t xml:space="preserve">region</w:t>
+              <w:t xml:space="preserve">anno</w:t>
             </w:r>
           </w:p>
         </w:tc>
@@ -439,18 +439,18 @@
               <w:pStyle w:val="Compact"/>
             </w:pPr>
             <w:r>
-              <w:t xml:space="preserve">0.033</w:t>
-            </w:r>
-          </w:p>
-        </w:tc>
-        <w:tc>
-          <w:tcPr/>
-          <w:p>
-            <w:pPr>
-              <w:pStyle w:val="Compact"/>
-            </w:pPr>
-            <w:r>
-              <w:t xml:space="preserve">0.127</w:t>
+              <w:t xml:space="preserve">0.031</w:t>
+            </w:r>
+          </w:p>
+        </w:tc>
+        <w:tc>
+          <w:tcPr/>
+          <w:p>
+            <w:pPr>
+              <w:pStyle w:val="Compact"/>
+            </w:pPr>
+            <w:r>
+              <w:t xml:space="preserve">0.109</w:t>
             </w:r>
           </w:p>
         </w:tc>
@@ -486,18 +486,18 @@
               <w:pStyle w:val="Compact"/>
             </w:pPr>
             <w:r>
-              <w:t xml:space="preserve">0.027</w:t>
-            </w:r>
-          </w:p>
-        </w:tc>
-        <w:tc>
-          <w:tcPr/>
-          <w:p>
-            <w:pPr>
-              <w:pStyle w:val="Compact"/>
-            </w:pPr>
-            <w:r>
-              <w:t xml:space="preserve">0.076</w:t>
+              <w:t xml:space="preserve">0.026</w:t>
+            </w:r>
+          </w:p>
+        </w:tc>
+        <w:tc>
+          <w:tcPr/>
+          <w:p>
+            <w:pPr>
+              <w:pStyle w:val="Compact"/>
+            </w:pPr>
+            <w:r>
+              <w:t xml:space="preserve">0.057</w:t>
             </w:r>
           </w:p>
         </w:tc>

</xml_diff>

<commit_message>
Commit final entrega Oxford
Esta es la version del codigo con la que se generaron los resultados que se envio a la revista de oxford
</commit_message>
<xml_diff>
--- a/src/results/chile/results_general.docx
+++ b/src/results/chile/results_general.docx
@@ -2,7 +2,7 @@
 <file path=word/document.xml><?xml version="1.0" encoding="utf-8"?>
 <w:document xmlns:w="http://schemas.openxmlformats.org/wordprocessingml/2006/main" xmlns:m="http://schemas.openxmlformats.org/officeDocument/2006/math" xmlns:r="http://schemas.openxmlformats.org/officeDocument/2006/relationships" xmlns:o="urn:schemas-microsoft-com:office:office" xmlns:v="urn:schemas-microsoft-com:vml" xmlns:w10="urn:schemas-microsoft-com:office:word" xmlns:a="http://schemas.openxmlformats.org/drawingml/2006/main" xmlns:pic="http://schemas.openxmlformats.org/drawingml/2006/picture" xmlns:wp="http://schemas.openxmlformats.org/drawingml/2006/wordprocessingDrawing">
   <w:body>
-    <w:bookmarkStart w:id="9" w:name="yhslrfmaqb"/>
+    <w:bookmarkStart w:id="9" w:name="qjpsqtyfku"/>
     <w:tbl>
       <w:tblPr>
         <w:tblStyle w:val="Table"/>
@@ -122,30 +122,30 @@
               <w:pStyle w:val="Compact"/>
             </w:pPr>
             <w:r>
-              <w:t xml:space="preserve">0.123**</w:t>
+              <w:t xml:space="preserve">0.156*</w:t>
             </w:r>
             <w:r>
               <w:br/>
             </w:r>
             <w:r>
-              <w:t xml:space="preserve">(0.012)</w:t>
-            </w:r>
-          </w:p>
-        </w:tc>
-        <w:tc>
-          <w:tcPr/>
-          <w:p>
-            <w:pPr>
-              <w:pStyle w:val="Compact"/>
-            </w:pPr>
-            <w:r>
-              <w:t xml:space="preserve">0.590**</w:t>
+              <w:t xml:space="preserve">(0.027)</w:t>
+            </w:r>
+          </w:p>
+        </w:tc>
+        <w:tc>
+          <w:tcPr/>
+          <w:p>
+            <w:pPr>
+              <w:pStyle w:val="Compact"/>
+            </w:pPr>
+            <w:r>
+              <w:t xml:space="preserve">0.656**</w:t>
             </w:r>
             <w:r>
               <w:br/>
             </w:r>
             <w:r>
-              <w:t xml:space="preserve">(0.046)</w:t>
+              <w:t xml:space="preserve">(0.097)</w:t>
             </w:r>
           </w:p>
         </w:tc>
@@ -169,30 +169,30 @@
               <w:pStyle w:val="Compact"/>
             </w:pPr>
             <w:r>
-              <w:t xml:space="preserve">-0.003</w:t>
+              <w:t xml:space="preserve">-0.078</w:t>
             </w:r>
             <w:r>
               <w:br/>
             </w:r>
             <w:r>
-              <w:t xml:space="preserve">(0.084)</w:t>
-            </w:r>
-          </w:p>
-        </w:tc>
-        <w:tc>
-          <w:tcPr/>
-          <w:p>
-            <w:pPr>
-              <w:pStyle w:val="Compact"/>
-            </w:pPr>
-            <w:r>
-              <w:t xml:space="preserve">0.164</w:t>
+              <w:t xml:space="preserve">(0.182)</w:t>
+            </w:r>
+          </w:p>
+        </w:tc>
+        <w:tc>
+          <w:tcPr/>
+          <w:p>
+            <w:pPr>
+              <w:pStyle w:val="Compact"/>
+            </w:pPr>
+            <w:r>
+              <w:t xml:space="preserve">0.913</w:t>
             </w:r>
             <w:r>
               <w:br/>
             </w:r>
             <w:r>
-              <w:t xml:space="preserve">(0.531)</w:t>
+              <w:t xml:space="preserve">(0.329)</w:t>
             </w:r>
           </w:p>
         </w:tc>
@@ -216,30 +216,30 @@
               <w:pStyle w:val="Compact"/>
             </w:pPr>
             <w:r>
-              <w:t xml:space="preserve">-0.001</w:t>
+              <w:t xml:space="preserve">0.088</w:t>
             </w:r>
             <w:r>
               <w:br/>
             </w:r>
             <w:r>
-              <w:t xml:space="preserve">(0.038)</w:t>
-            </w:r>
-          </w:p>
-        </w:tc>
-        <w:tc>
-          <w:tcPr/>
-          <w:p>
-            <w:pPr>
-              <w:pStyle w:val="Compact"/>
-            </w:pPr>
-            <w:r>
-              <w:t xml:space="preserve">-0.541</w:t>
+              <w:t xml:space="preserve">(0.103)</w:t>
+            </w:r>
+          </w:p>
+        </w:tc>
+        <w:tc>
+          <w:tcPr/>
+          <w:p>
+            <w:pPr>
+              <w:pStyle w:val="Compact"/>
+            </w:pPr>
+            <w:r>
+              <w:t xml:space="preserve">-1.198**</w:t>
             </w:r>
             <w:r>
               <w:br/>
             </w:r>
             <w:r>
-              <w:t xml:space="preserve">(0.279)</w:t>
+              <w:t xml:space="preserve">(0.117)</w:t>
             </w:r>
           </w:p>
         </w:tc>
@@ -439,18 +439,18 @@
               <w:pStyle w:val="Compact"/>
             </w:pPr>
             <w:r>
-              <w:t xml:space="preserve">0.031</w:t>
-            </w:r>
-          </w:p>
-        </w:tc>
-        <w:tc>
-          <w:tcPr/>
-          <w:p>
-            <w:pPr>
-              <w:pStyle w:val="Compact"/>
-            </w:pPr>
-            <w:r>
-              <w:t xml:space="preserve">0.109</w:t>
+              <w:t xml:space="preserve">0.033</w:t>
+            </w:r>
+          </w:p>
+        </w:tc>
+        <w:tc>
+          <w:tcPr/>
+          <w:p>
+            <w:pPr>
+              <w:pStyle w:val="Compact"/>
+            </w:pPr>
+            <w:r>
+              <w:t xml:space="preserve">0.127</w:t>
             </w:r>
           </w:p>
         </w:tc>
@@ -486,18 +486,18 @@
               <w:pStyle w:val="Compact"/>
             </w:pPr>
             <w:r>
-              <w:t xml:space="preserve">0.026</w:t>
-            </w:r>
-          </w:p>
-        </w:tc>
-        <w:tc>
-          <w:tcPr/>
-          <w:p>
-            <w:pPr>
-              <w:pStyle w:val="Compact"/>
-            </w:pPr>
-            <w:r>
-              <w:t xml:space="preserve">0.057</w:t>
+              <w:t xml:space="preserve">0.027</w:t>
+            </w:r>
+          </w:p>
+        </w:tc>
+        <w:tc>
+          <w:tcPr/>
+          <w:p>
+            <w:pPr>
+              <w:pStyle w:val="Compact"/>
+            </w:pPr>
+            <w:r>
+              <w:t xml:space="preserve">0.076</w:t>
             </w:r>
           </w:p>
         </w:tc>

</xml_diff>